<commit_message>
Rewrite CVs with verified details, add AI version and linkedin.md
- Mobile (Android & Flutter) is now the primary version; added AI version
- Will Bank: real backend scope (4 Rust/Java/JS microservices on AWS +
  PostgreSQL, Java-to-Rust migration, SDUI cutting a two-week release
  cycle, RFCs/ADRs); removed unverified p99 claim
- Unico: official titles and 2022 promotion, CODEOWNERS modularization,
  final year on Go backend and React
- ICC backend corrected to JavaScript; Belo Horizonte location
- Independent role reflects current AI content work; Darkrunner moved
  to Projects with real numbers
- Added Google Cloud certification and EF SET score
- linkedin.md lists every LinkedIn field ready to copy, replacing
  linkedin/profile.md

Co-Authored-By: Claude Opus 5.5 <noreply@anthropic.com>
Claude-Session: https://claude.ai/code/session_014tF2mZxbJZvQiCs7QA6cz7
</commit_message>
<xml_diff>
--- a/dist/Lucas-Selani-CV-Fullstack-EN.docx
+++ b/dist/Lucas-Selani-CV-Fullstack-EN.docx
@@ -2,7 +2,7 @@
 <file path=word/document.xml><?xml version="1.0" encoding="utf-8"?>
 <w:document xmlns:w="http://schemas.openxmlformats.org/wordprocessingml/2006/main" xmlns:m="http://schemas.openxmlformats.org/officeDocument/2006/math" xmlns:r="http://schemas.openxmlformats.org/officeDocument/2006/relationships" xmlns:o="urn:schemas-microsoft-com:office:office" xmlns:v="urn:schemas-microsoft-com:vml" xmlns:w10="urn:schemas-microsoft-com:office:word" xmlns:a="http://schemas.openxmlformats.org/drawingml/2006/main" xmlns:pic="http://schemas.openxmlformats.org/drawingml/2006/picture" xmlns:wp="http://schemas.openxmlformats.org/drawingml/2006/wordprocessingDrawing">
   <w:body>
-    <w:bookmarkStart w:id="21" w:name="lucas-selani"/>
+    <w:bookmarkStart w:id="24" w:name="lucas-selani"/>
     <w:p>
       <w:pPr>
         <w:pStyle w:val="Heading1"/>
@@ -20,7 +20,7 @@
           <w:b/>
           <w:bCs/>
         </w:rPr>
-        <w:t xml:space="preserve">Senior Software Engineer — Fullstack &amp; Mobile (TypeScript/Node.js · Rust · Flutter)</w:t>
+        <w:t xml:space="preserve">Senior Software Engineer — Fullstack &amp; Mobile · Rust, Java, Go, React, Flutter · AWS/GCP</w:t>
       </w:r>
     </w:p>
     <w:p>
@@ -28,7 +28,7 @@
         <w:pStyle w:val="BodyText"/>
       </w:pPr>
       <w:r>
-        <w:t xml:space="preserve">Brazil · Remote (UTC-3, overlaps US and EU hours) · Full-time or contractor</w:t>
+        <w:t xml:space="preserve">Belo Horizonte, Brazil · Remote (US, Brazil and Europe time zones) · Full-time or contractor</w:t>
       </w:r>
     </w:p>
     <w:p>
@@ -81,7 +81,7 @@
         <w:pStyle w:val="FirstParagraph"/>
       </w:pPr>
       <w:r>
-        <w:t xml:space="preserve">Senior Software Engineer with 8+ years building products end to end, from backend tooling in Rust and TypeScript/Node.js to Flutter and native Android apps, in fintech (10M+ users) and digital identity. Architected a full-stack Server-Driven UI (SDUI) platform at Will Bank: a Rust layer serializes backend models into a typed JSON contract rendered by a Flutter engine, so security flows ship without app-store releases. Currently building a TypeScript multi-agent AI orchestration pipeline.</w:t>
+        <w:t xml:space="preserve">Senior Software Engineer with 9+ years building products end to end in fintech (10M+ users) and digital identity (200k+ active users). Writes backend services in Rust, Java and Go on AWS with PostgreSQL, and the mobile and web clients that use them in Flutter, native Android and React. At Will Bank, built a full-stack Server-Driven UI (SDUI) system that turned a two-week release cycle into an instant backend change, and migrated a legacy Java service to Rust.</w:t>
       </w:r>
     </w:p>
     <w:bookmarkEnd w:id="11"/>
@@ -107,13 +107,13 @@
           <w:b/>
           <w:bCs/>
         </w:rPr>
-        <w:t xml:space="preserve">Backend &amp; Languages:</w:t>
-      </w:r>
-      <w:r>
-        <w:t xml:space="preserve"> </w:t>
-      </w:r>
-      <w:r>
-        <w:t xml:space="preserve">TypeScript, Node.js, Rust, Kotlin, Java, Dart, REST APIs, JSON contracts/serialization, Microservices</w:t>
+        <w:t xml:space="preserve">Backend:</w:t>
+      </w:r>
+      <w:r>
+        <w:t xml:space="preserve"> </w:t>
+      </w:r>
+      <w:r>
+        <w:t xml:space="preserve">Rust, Java, Go, Node.js/JavaScript, TypeScript, REST APIs, Microservices, PostgreSQL, Redis</w:t>
       </w:r>
     </w:p>
     <w:p>
@@ -129,13 +129,13 @@
           <w:b/>
           <w:bCs/>
         </w:rPr>
-        <w:t xml:space="preserve">Architecture:</w:t>
-      </w:r>
-      <w:r>
-        <w:t xml:space="preserve"> </w:t>
-      </w:r>
-      <w:r>
-        <w:t xml:space="preserve">Server-Driven UI (SDUI), System Design, Clean Architecture, Modular Architecture, Monorepos, Micro-frontends, Design Systems</w:t>
+        <w:t xml:space="preserve">Cloud &amp; DevOps:</w:t>
+      </w:r>
+      <w:r>
+        <w:t xml:space="preserve"> </w:t>
+      </w:r>
+      <w:r>
+        <w:t xml:space="preserve">AWS, GCP, Docker, Kubernetes, Terraform, CI/CD (GitHub Actions), Trunk-Based Development, Feature Flags</w:t>
       </w:r>
     </w:p>
     <w:p>
@@ -151,13 +151,13 @@
           <w:b/>
           <w:bCs/>
         </w:rPr>
-        <w:t xml:space="preserve">Mobile:</w:t>
-      </w:r>
-      <w:r>
-        <w:t xml:space="preserve"> </w:t>
-      </w:r>
-      <w:r>
-        <w:t xml:space="preserve">Flutter, Android (Kotlin/Java), iOS</w:t>
+        <w:t xml:space="preserve">Mobile &amp; Web:</w:t>
+      </w:r>
+      <w:r>
+        <w:t xml:space="preserve"> </w:t>
+      </w:r>
+      <w:r>
+        <w:t xml:space="preserve">Flutter, Dart, Android (Kotlin, Java), iOS via Flutter, React, BLoC, Firebase</w:t>
       </w:r>
     </w:p>
     <w:p>
@@ -173,13 +173,13 @@
           <w:b/>
           <w:bCs/>
         </w:rPr>
-        <w:t xml:space="preserve">DevOps &amp; Quality:</w:t>
-      </w:r>
-      <w:r>
-        <w:t xml:space="preserve"> </w:t>
-      </w:r>
-      <w:r>
-        <w:t xml:space="preserve">CI/CD (GitHub Actions), Trunk-Based Development, Git, Automated Testing, Playwright</w:t>
+        <w:t xml:space="preserve">Architecture:</w:t>
+      </w:r>
+      <w:r>
+        <w:t xml:space="preserve"> </w:t>
+      </w:r>
+      <w:r>
+        <w:t xml:space="preserve">Server-Driven UI (SDUI), Microservices, Clean Architecture, Modular Architecture, Design Systems, RFCs and ADRs</w:t>
       </w:r>
     </w:p>
     <w:p>
@@ -195,13 +195,13 @@
           <w:b/>
           <w:bCs/>
         </w:rPr>
-        <w:t xml:space="preserve">AI &amp; Automation:</w:t>
-      </w:r>
-      <w:r>
-        <w:t xml:space="preserve"> </w:t>
-      </w:r>
-      <w:r>
-        <w:t xml:space="preserve">LLM agents, AI orchestration, LLM integration (Ollama, Gemini), ComfyUI, Remotion, FFmpeg</w:t>
+        <w:t xml:space="preserve">AI:</w:t>
+      </w:r>
+      <w:r>
+        <w:t xml:space="preserve"> </w:t>
+      </w:r>
+      <w:r>
+        <w:t xml:space="preserve">LLM agents, Claude Code, Ollama, ComfyUI, Remotion, Playwright</w:t>
       </w:r>
     </w:p>
     <w:bookmarkEnd w:id="12"/>
@@ -214,13 +214,13 @@
         <w:t xml:space="preserve">Experience</w:t>
       </w:r>
     </w:p>
-    <w:bookmarkStart w:id="13" w:name="X9fff9d946fa0942f234786b27d92f89ebc7ef90"/>
+    <w:bookmarkStart w:id="13" w:name="Xea7cc6382750d87503765e741fafa74c2a8eff5"/>
     <w:p>
       <w:pPr>
         <w:pStyle w:val="Heading3"/>
       </w:pPr>
       <w:r>
-        <w:t xml:space="preserve">Senior Software Engineer — Independent (Self-employed) | Jul 2026 – Present</w:t>
+        <w:t xml:space="preserve">Senior Software Engineer — Independent | Jul 2026 – Present</w:t>
       </w:r>
     </w:p>
     <w:p>
@@ -232,115 +232,7 @@
         </w:numPr>
       </w:pPr>
       <w:r>
-        <w:t xml:space="preserve">Building</w:t>
-      </w:r>
-      <w:r>
-        <w:t xml:space="preserve"> </w:t>
-      </w:r>
-      <w:r>
-        <w:rPr>
-          <w:b/>
-          <w:bCs/>
-        </w:rPr>
-        <w:t xml:space="preserve">Darkrunner</w:t>
-      </w:r>
-      <w:r>
-        <w:t xml:space="preserve">, a</w:t>
-      </w:r>
-      <w:r>
-        <w:t xml:space="preserve"> </w:t>
-      </w:r>
-      <w:r>
-        <w:rPr>
-          <w:b/>
-          <w:bCs/>
-        </w:rPr>
-        <w:t xml:space="preserve">TypeScript/Node.js</w:t>
-      </w:r>
-      <w:r>
-        <w:t xml:space="preserve"> </w:t>
-      </w:r>
-      <w:r>
-        <w:t xml:space="preserve">multi-agent AI orchestration pipeline (monorepo) where scripting, planning and QA agents produce YouTube videos end to end with no manual editing.</w:t>
-      </w:r>
-    </w:p>
-    <w:p>
-      <w:pPr>
-        <w:pStyle w:val="Compact"/>
-        <w:numPr>
-          <w:ilvl w:val="0"/>
-          <w:numId w:val="1002"/>
-        </w:numPr>
-      </w:pPr>
-      <w:r>
-        <w:t xml:space="preserve">Integrated</w:t>
-      </w:r>
-      <w:r>
-        <w:t xml:space="preserve"> </w:t>
-      </w:r>
-      <w:r>
-        <w:rPr>
-          <w:b/>
-          <w:bCs/>
-        </w:rPr>
-        <w:t xml:space="preserve">Remotion</w:t>
-      </w:r>
-      <w:r>
-        <w:t xml:space="preserve"> </w:t>
-      </w:r>
-      <w:r>
-        <w:t xml:space="preserve">for programmatic video rendering and</w:t>
-      </w:r>
-      <w:r>
-        <w:t xml:space="preserve"> </w:t>
-      </w:r>
-      <w:r>
-        <w:rPr>
-          <w:b/>
-          <w:bCs/>
-        </w:rPr>
-        <w:t xml:space="preserve">Playwright</w:t>
-      </w:r>
-      <w:r>
-        <w:t xml:space="preserve"> </w:t>
-      </w:r>
-      <w:r>
-        <w:t xml:space="preserve">for web automation, with local model inference (</w:t>
-      </w:r>
-      <w:r>
-        <w:rPr>
-          <w:b/>
-          <w:bCs/>
-        </w:rPr>
-        <w:t xml:space="preserve">Ollama</w:t>
-      </w:r>
-      <w:r>
-        <w:t xml:space="preserve">,</w:t>
-      </w:r>
-      <w:r>
-        <w:t xml:space="preserve"> </w:t>
-      </w:r>
-      <w:r>
-        <w:rPr>
-          <w:b/>
-          <w:bCs/>
-        </w:rPr>
-        <w:t xml:space="preserve">ComfyUI</w:t>
-      </w:r>
-      <w:r>
-        <w:t xml:space="preserve">) generating images, TTS and scripts on demand.</w:t>
-      </w:r>
-    </w:p>
-    <w:p>
-      <w:pPr>
-        <w:pStyle w:val="Compact"/>
-        <w:numPr>
-          <w:ilvl w:val="0"/>
-          <w:numId w:val="1002"/>
-        </w:numPr>
-      </w:pPr>
-      <w:r>
-        <w:t xml:space="preserve">Stack: TypeScript, Node.js, LLM agents, Remotion, Playwright, Ollama, ComfyUI, FFmpeg.</w:t>
+        <w:t xml:space="preserve">Building AI automation projects: an agent-driven YouTube content operation that uses Claude Code jobs, scripts and documentation for niche research, scripting, narration and video generation.</w:t>
       </w:r>
     </w:p>
     <w:bookmarkEnd w:id="13"/>
@@ -362,7 +254,7 @@
           <w:i/>
           <w:iCs/>
         </w:rPr>
-        <w:t xml:space="preserve">Fintech with 10M+ users · Fraud Prevention &amp; Security · Remote · Engineering department closed in Jul 2026.</w:t>
+        <w:t xml:space="preserve">Fintech with 10M+ users · Fraud Prevention · Remote · Engineering department closed in Jul 2026.</w:t>
       </w:r>
     </w:p>
     <w:p>
@@ -374,23 +266,75 @@
         </w:numPr>
       </w:pPr>
       <w:r>
-        <w:t xml:space="preserve">Architected a</w:t>
-      </w:r>
-      <w:r>
-        <w:t xml:space="preserve"> </w:t>
-      </w:r>
-      <w:r>
-        <w:rPr>
-          <w:b/>
-          <w:bCs/>
-        </w:rPr>
-        <w:t xml:space="preserve">Server-Driven UI (SDUI)</w:t>
-      </w:r>
-      <w:r>
-        <w:t xml:space="preserve"> </w:t>
-      </w:r>
-      <w:r>
-        <w:t xml:space="preserve">platform spanning backend and client, decoupling security challenges from app releases and enabling instant hotfixes and A/B tests without app-store review.</w:t>
+        <w:t xml:space="preserve">Developed and maintained 4 backend microservices (</w:t>
+      </w:r>
+      <w:r>
+        <w:rPr>
+          <w:b/>
+          <w:bCs/>
+        </w:rPr>
+        <w:t xml:space="preserve">Rust</w:t>
+      </w:r>
+      <w:r>
+        <w:t xml:space="preserve">,</w:t>
+      </w:r>
+      <w:r>
+        <w:t xml:space="preserve"> </w:t>
+      </w:r>
+      <w:r>
+        <w:rPr>
+          <w:b/>
+          <w:bCs/>
+        </w:rPr>
+        <w:t xml:space="preserve">Java</w:t>
+      </w:r>
+      <w:r>
+        <w:t xml:space="preserve">, JavaScript) on</w:t>
+      </w:r>
+      <w:r>
+        <w:t xml:space="preserve"> </w:t>
+      </w:r>
+      <w:r>
+        <w:rPr>
+          <w:b/>
+          <w:bCs/>
+        </w:rPr>
+        <w:t xml:space="preserve">AWS</w:t>
+      </w:r>
+      <w:r>
+        <w:t xml:space="preserve"> </w:t>
+      </w:r>
+      <w:r>
+        <w:t xml:space="preserve">with</w:t>
+      </w:r>
+      <w:r>
+        <w:t xml:space="preserve"> </w:t>
+      </w:r>
+      <w:r>
+        <w:rPr>
+          <w:b/>
+          <w:bCs/>
+        </w:rPr>
+        <w:t xml:space="preserve">PostgreSQL</w:t>
+      </w:r>
+      <w:r>
+        <w:t xml:space="preserve"> </w:t>
+      </w:r>
+      <w:r>
+        <w:t xml:space="preserve">for the security challenge flow, which is called on</w:t>
+      </w:r>
+      <w:r>
+        <w:t xml:space="preserve"> </w:t>
+      </w:r>
+      <w:r>
+        <w:rPr>
+          <w:b/>
+          <w:bCs/>
+        </w:rPr>
+        <w:t xml:space="preserve">every Pix transaction</w:t>
+      </w:r>
+      <w:r>
+        <w:t xml:space="preserve">: the app sends the flow (Pix, card and others) and the backend decides which challenge to show.</w:t>
       </w:r>
     </w:p>
     <w:p>
@@ -402,23 +346,71 @@
         </w:numPr>
       </w:pPr>
       <w:r>
-        <w:t xml:space="preserve">Built high-performance</w:t>
-      </w:r>
-      <w:r>
-        <w:t xml:space="preserve"> </w:t>
-      </w:r>
-      <w:r>
-        <w:rPr>
-          <w:b/>
-          <w:bCs/>
-        </w:rPr>
-        <w:t xml:space="preserve">Rust</w:t>
-      </w:r>
-      <w:r>
-        <w:t xml:space="preserve"> </w:t>
-      </w:r>
-      <w:r>
-        <w:t xml:space="preserve">tooling that serializes backend structs into the JSON contract consumed by the Flutter SDUI engine, keeping type safety end to end and meeting p99 latency requirements.</w:t>
+        <w:t xml:space="preserve">Built a full-stack</w:t>
+      </w:r>
+      <w:r>
+        <w:t xml:space="preserve"> </w:t>
+      </w:r>
+      <w:r>
+        <w:rPr>
+          <w:b/>
+          <w:bCs/>
+        </w:rPr>
+        <w:t xml:space="preserve">Server-Driven UI (SDUI)</w:t>
+      </w:r>
+      <w:r>
+        <w:t xml:space="preserve"> </w:t>
+      </w:r>
+      <w:r>
+        <w:t xml:space="preserve">system on top of it: the backend returns the screens and the</w:t>
+      </w:r>
+      <w:r>
+        <w:t xml:space="preserve"> </w:t>
+      </w:r>
+      <w:r>
+        <w:rPr>
+          <w:b/>
+          <w:bCs/>
+        </w:rPr>
+        <w:t xml:space="preserve">Flutter</w:t>
+      </w:r>
+      <w:r>
+        <w:t xml:space="preserve"> </w:t>
+      </w:r>
+      <w:r>
+        <w:t xml:space="preserve">app only renders them, so changes to the card password screens went from a</w:t>
+      </w:r>
+      <w:r>
+        <w:t xml:space="preserve"> </w:t>
+      </w:r>
+      <w:r>
+        <w:rPr>
+          <w:b/>
+          <w:bCs/>
+        </w:rPr>
+        <w:t xml:space="preserve">two-week release cycle</w:t>
+      </w:r>
+      <w:r>
+        <w:t xml:space="preserve"> </w:t>
+      </w:r>
+      <w:r>
+        <w:t xml:space="preserve">(code freeze, beta, store rollout) to an</w:t>
+      </w:r>
+      <w:r>
+        <w:t xml:space="preserve"> </w:t>
+      </w:r>
+      <w:r>
+        <w:rPr>
+          <w:b/>
+          <w:bCs/>
+        </w:rPr>
+        <w:t xml:space="preserve">instant backend change</w:t>
+      </w:r>
+      <w:r>
+        <w:t xml:space="preserve"> </w:t>
+      </w:r>
+      <w:r>
+        <w:t xml:space="preserve">behind a feature flag.</w:t>
       </w:r>
     </w:p>
     <w:p>
@@ -430,20 +422,7 @@
         </w:numPr>
       </w:pPr>
       <w:r>
-        <w:t xml:space="preserve">Engineered the</w:t>
-      </w:r>
-      <w:r>
-        <w:t xml:space="preserve"> </w:t>
-      </w:r>
-      <w:r>
-        <w:rPr>
-          <w:b/>
-          <w:bCs/>
-        </w:rPr>
-        <w:t xml:space="preserve">cash-in/cash-out security flows</w:t>
-      </w:r>
-      <w:r>
-        <w:t xml:space="preserve">, designing adaptive challenge mechanisms that analyze user data in real time to approve transactions for a 10M+ user base.</w:t>
+        <w:t xml:space="preserve">Migrated the legacy Java card password service to Rust as the sole engineer on it, and moved its screens to SDUI.</w:t>
       </w:r>
     </w:p>
     <w:p>
@@ -455,17 +434,29 @@
         </w:numPr>
       </w:pPr>
       <w:r>
-        <w:t xml:space="preserve">Stack: Rust, Flutter/Dart, Server-Driven UI, JSON APIs, CI/CD.</w:t>
+        <w:t xml:space="preserve">Wrote RFCs and ADRs for the service migration, the app’s move to SDUI and a refactor of the fraud prevention package that added events and logs to a buggy, unobservable codebase.</w:t>
+      </w:r>
+    </w:p>
+    <w:p>
+      <w:pPr>
+        <w:pStyle w:val="Compact"/>
+        <w:numPr>
+          <w:ilvl w:val="0"/>
+          <w:numId w:val="1003"/>
+        </w:numPr>
+      </w:pPr>
+      <w:r>
+        <w:t xml:space="preserve">Stack: Rust, Java, JavaScript, AWS, PostgreSQL, Flutter, Dart, Server-Driven UI, Feature Flags.</w:t>
       </w:r>
     </w:p>
     <w:bookmarkEnd w:id="14"/>
-    <w:bookmarkStart w:id="15" w:name="Xa312689b92d603ee488e36de504d1ffe2889745"/>
+    <w:bookmarkStart w:id="15" w:name="X2bd682157e125f4fdf3e0812a38bd5f2a0f60e1"/>
     <w:p>
       <w:pPr>
         <w:pStyle w:val="Heading3"/>
       </w:pPr>
       <w:r>
-        <w:t xml:space="preserve">Senior Flutter Developer — Unico IDtech | Jun 2020 – Nov 2024</w:t>
+        <w:t xml:space="preserve">Senior Software Developer — Unico IDtech | Jun 2020 – Nov 2024</w:t>
       </w:r>
     </w:p>
     <w:p>
@@ -477,7 +468,7 @@
           <w:i/>
           <w:iCs/>
         </w:rPr>
-        <w:t xml:space="preserve">Brazil’s leader in digital identity · Remote.</w:t>
+        <w:t xml:space="preserve">Brazil’s leader in digital identity · Remote · Joined as Software Developer, promoted to Senior (IC5) in 2022.</w:t>
       </w:r>
     </w:p>
     <w:p>
@@ -489,36 +480,39 @@
         </w:numPr>
       </w:pPr>
       <w:r>
-        <w:t xml:space="preserve">Architected and scaled a multi-module</w:t>
-      </w:r>
-      <w:r>
-        <w:t xml:space="preserve"> </w:t>
-      </w:r>
-      <w:r>
-        <w:rPr>
-          <w:b/>
-          <w:bCs/>
-        </w:rPr>
-        <w:t xml:space="preserve">Flutter super-app</w:t>
-      </w:r>
-      <w:r>
-        <w:t xml:space="preserve"> </w:t>
-      </w:r>
-      <w:r>
-        <w:t xml:space="preserve">serving</w:t>
-      </w:r>
-      <w:r>
-        <w:t xml:space="preserve"> </w:t>
-      </w:r>
-      <w:r>
-        <w:rPr>
-          <w:b/>
-          <w:bCs/>
-        </w:rPr>
-        <w:t xml:space="preserve">200k+ active users</w:t>
-      </w:r>
-      <w:r>
-        <w:t xml:space="preserve">, integrating secure facial biometrics and digital documents.</w:t>
+        <w:t xml:space="preserve">Moved into fullstack work in the final year: 6 months as a backend engineer in</w:t>
+      </w:r>
+      <w:r>
+        <w:t xml:space="preserve"> </w:t>
+      </w:r>
+      <w:r>
+        <w:rPr>
+          <w:b/>
+          <w:bCs/>
+        </w:rPr>
+        <w:t xml:space="preserve">Go</w:t>
+      </w:r>
+      <w:r>
+        <w:t xml:space="preserve"> </w:t>
+      </w:r>
+      <w:r>
+        <w:t xml:space="preserve">(after contributing to the Go BFF) and 6 months on</w:t>
+      </w:r>
+      <w:r>
+        <w:t xml:space="preserve"> </w:t>
+      </w:r>
+      <w:r>
+        <w:rPr>
+          <w:b/>
+          <w:bCs/>
+        </w:rPr>
+        <w:t xml:space="preserve">React</w:t>
+      </w:r>
+      <w:r>
+        <w:t xml:space="preserve"> </w:t>
+      </w:r>
+      <w:r>
+        <w:t xml:space="preserve">web.</w:t>
       </w:r>
     </w:p>
     <w:p>
@@ -530,36 +524,36 @@
         </w:numPr>
       </w:pPr>
       <w:r>
-        <w:t xml:space="preserve">Designed the foundational</w:t>
-      </w:r>
-      <w:r>
-        <w:t xml:space="preserve"> </w:t>
-      </w:r>
-      <w:r>
-        <w:rPr>
-          <w:b/>
-          <w:bCs/>
-        </w:rPr>
-        <w:t xml:space="preserve">Core Module</w:t>
-      </w:r>
-      <w:r>
-        <w:t xml:space="preserve"> </w:t>
-      </w:r>
-      <w:r>
-        <w:t xml:space="preserve">and</w:t>
-      </w:r>
-      <w:r>
-        <w:t xml:space="preserve"> </w:t>
-      </w:r>
-      <w:r>
-        <w:rPr>
-          <w:b/>
-          <w:bCs/>
-        </w:rPr>
-        <w:t xml:space="preserve">Design System</w:t>
-      </w:r>
-      <w:r>
-        <w:t xml:space="preserve">, a reusable widget library adopted by every Flutter project in the company.</w:t>
+        <w:t xml:space="preserve">Architected and scaled a multi-module</w:t>
+      </w:r>
+      <w:r>
+        <w:t xml:space="preserve"> </w:t>
+      </w:r>
+      <w:r>
+        <w:rPr>
+          <w:b/>
+          <w:bCs/>
+        </w:rPr>
+        <w:t xml:space="preserve">Flutter super-app</w:t>
+      </w:r>
+      <w:r>
+        <w:t xml:space="preserve"> </w:t>
+      </w:r>
+      <w:r>
+        <w:t xml:space="preserve">serving</w:t>
+      </w:r>
+      <w:r>
+        <w:t xml:space="preserve"> </w:t>
+      </w:r>
+      <w:r>
+        <w:rPr>
+          <w:b/>
+          <w:bCs/>
+        </w:rPr>
+        <w:t xml:space="preserve">200k+ active users</w:t>
+      </w:r>
+      <w:r>
+        <w:t xml:space="preserve">, with facial biometrics and digital documents.</w:t>
       </w:r>
     </w:p>
     <w:p>
@@ -571,36 +565,20 @@
         </w:numPr>
       </w:pPr>
       <w:r>
-        <w:t xml:space="preserve">Built the</w:t>
-      </w:r>
-      <w:r>
-        <w:t xml:space="preserve"> </w:t>
-      </w:r>
-      <w:r>
-        <w:rPr>
-          <w:b/>
-          <w:bCs/>
-        </w:rPr>
-        <w:t xml:space="preserve">CI/CD</w:t>
-      </w:r>
-      <w:r>
-        <w:t xml:space="preserve"> </w:t>
-      </w:r>
-      <w:r>
-        <w:t xml:space="preserve">pipeline for a</w:t>
-      </w:r>
-      <w:r>
-        <w:t xml:space="preserve"> </w:t>
-      </w:r>
-      <w:r>
-        <w:rPr>
-          <w:b/>
-          <w:bCs/>
-        </w:rPr>
-        <w:t xml:space="preserve">trunk-based monorepo</w:t>
-      </w:r>
-      <w:r>
-        <w:t xml:space="preserve">, automating tests and enabling a reliable weekly release train to the App Store and Google Play.</w:t>
+        <w:t xml:space="preserve">Split the app into feature packages owned by each team through</w:t>
+      </w:r>
+      <w:r>
+        <w:t xml:space="preserve"> </w:t>
+      </w:r>
+      <w:r>
+        <w:rPr>
+          <w:b/>
+          <w:bCs/>
+        </w:rPr>
+        <w:t xml:space="preserve">CODEOWNERS</w:t>
+      </w:r>
+      <w:r>
+        <w:t xml:space="preserve">, which cut build times and merge conflicts, kept reviews with the owning team and let each module run on its own.</w:t>
       </w:r>
     </w:p>
     <w:p>
@@ -612,17 +590,77 @@
         </w:numPr>
       </w:pPr>
       <w:r>
-        <w:t xml:space="preserve">Stack: Flutter, Dart, Clean Architecture, Modular Architecture, Monorepo, GitHub Actions.</w:t>
+        <w:t xml:space="preserve">Designed the</w:t>
+      </w:r>
+      <w:r>
+        <w:t xml:space="preserve"> </w:t>
+      </w:r>
+      <w:r>
+        <w:rPr>
+          <w:b/>
+          <w:bCs/>
+        </w:rPr>
+        <w:t xml:space="preserve">Core Module</w:t>
+      </w:r>
+      <w:r>
+        <w:t xml:space="preserve"> </w:t>
+      </w:r>
+      <w:r>
+        <w:t xml:space="preserve">and the</w:t>
+      </w:r>
+      <w:r>
+        <w:t xml:space="preserve"> </w:t>
+      </w:r>
+      <w:r>
+        <w:rPr>
+          <w:b/>
+          <w:bCs/>
+        </w:rPr>
+        <w:t xml:space="preserve">Design System</w:t>
+      </w:r>
+      <w:r>
+        <w:t xml:space="preserve"> </w:t>
+      </w:r>
+      <w:r>
+        <w:t xml:space="preserve">used by every module of the super-app, and built</w:t>
+      </w:r>
+      <w:r>
+        <w:t xml:space="preserve"> </w:t>
+      </w:r>
+      <w:r>
+        <w:rPr>
+          <w:b/>
+          <w:bCs/>
+        </w:rPr>
+        <w:t xml:space="preserve">CI/CD</w:t>
+      </w:r>
+      <w:r>
+        <w:t xml:space="preserve"> </w:t>
+      </w:r>
+      <w:r>
+        <w:t xml:space="preserve">for the trunk-based monorepo with a weekly release train.</w:t>
+      </w:r>
+    </w:p>
+    <w:p>
+      <w:pPr>
+        <w:pStyle w:val="Compact"/>
+        <w:numPr>
+          <w:ilvl w:val="0"/>
+          <w:numId w:val="1004"/>
+        </w:numPr>
+      </w:pPr>
+      <w:r>
+        <w:t xml:space="preserve">Stack: Go, React, Flutter, Dart, Monorepo, GitHub Actions.</w:t>
       </w:r>
     </w:p>
     <w:bookmarkEnd w:id="15"/>
-    <w:bookmarkStart w:id="16" w:name="Xd99d886d0bdee432f4b41dfa7d542a1649abefa"/>
+    <w:bookmarkStart w:id="16" w:name="X1855c49b6411e884501a3561151019dfbe0422d"/>
     <w:p>
       <w:pPr>
         <w:pStyle w:val="Heading3"/>
       </w:pPr>
       <w:r>
-        <w:t xml:space="preserve">Android Developer (Mid-level) — Toodoo | Jan 2019 – Jun 2020</w:t>
+        <w:t xml:space="preserve">Android Developer — Toodoo | Jan 2019 – Jun 2020</w:t>
       </w:r>
     </w:p>
     <w:p>
@@ -634,7 +672,7 @@
           <w:i/>
           <w:iCs/>
         </w:rPr>
-        <w:t xml:space="preserve">São Paulo, Brazil.</w:t>
+        <w:t xml:space="preserve">São Paulo, Brazil · Agency projects.</w:t>
       </w:r>
     </w:p>
     <w:p>
@@ -646,7 +684,23 @@
         </w:numPr>
       </w:pPr>
       <w:r>
-        <w:t xml:space="preserve">Delivered high-impact features for enterprise clients, including a digital banking module for</w:t>
+        <w:t xml:space="preserve">Built native</w:t>
+      </w:r>
+      <w:r>
+        <w:t xml:space="preserve"> </w:t>
+      </w:r>
+      <w:r>
+        <w:rPr>
+          <w:b/>
+          <w:bCs/>
+        </w:rPr>
+        <w:t xml:space="preserve">Android</w:t>
+      </w:r>
+      <w:r>
+        <w:t xml:space="preserve"> </w:t>
+      </w:r>
+      <w:r>
+        <w:t xml:space="preserve">features for client apps, including a digital banking module for</w:t>
       </w:r>
       <w:r>
         <w:t xml:space="preserve"> </w:t>
@@ -675,19 +729,7 @@
         <w:t xml:space="preserve">Burger King</w:t>
       </w:r>
       <w:r>
-        <w:t xml:space="preserve">.</w:t>
-      </w:r>
-    </w:p>
-    <w:p>
-      <w:pPr>
-        <w:pStyle w:val="Compact"/>
-        <w:numPr>
-          <w:ilvl w:val="0"/>
-          <w:numId w:val="1005"/>
-        </w:numPr>
-      </w:pPr>
-      <w:r>
-        <w:t xml:space="preserve">Built a native Android app from scratch for</w:t>
+        <w:t xml:space="preserve">, and an app from scratch for</w:t>
       </w:r>
       <w:r>
         <w:t xml:space="preserve"> </w:t>
@@ -703,7 +745,7 @@
         <w:t xml:space="preserve"> </w:t>
       </w:r>
       <w:r>
-        <w:t xml:space="preserve">to handle phone carrier portability.</w:t>
+        <w:t xml:space="preserve">(carrier portability).</w:t>
       </w:r>
     </w:p>
     <w:bookmarkEnd w:id="16"/>
@@ -737,23 +779,7 @@
         </w:numPr>
       </w:pPr>
       <w:r>
-        <w:t xml:space="preserve">Developed</w:t>
-      </w:r>
-      <w:r>
-        <w:t xml:space="preserve"> </w:t>
-      </w:r>
-      <w:r>
-        <w:rPr>
-          <w:b/>
-          <w:bCs/>
-        </w:rPr>
-        <w:t xml:space="preserve">Java backend</w:t>
-      </w:r>
-      <w:r>
-        <w:t xml:space="preserve"> </w:t>
-      </w:r>
-      <w:r>
-        <w:t xml:space="preserve">solutions for a large-scale</w:t>
+        <w:t xml:space="preserve">Developed backend features in JavaScript on a proprietary platform for a large</w:t>
       </w:r>
       <w:r>
         <w:t xml:space="preserve"> </w:t>
@@ -769,7 +795,23 @@
         <w:t xml:space="preserve"> </w:t>
       </w:r>
       <w:r>
-        <w:t xml:space="preserve">telecom project with 400+ people.</w:t>
+        <w:t xml:space="preserve">telecom project with 400+ people, and native</w:t>
+      </w:r>
+      <w:r>
+        <w:t xml:space="preserve"> </w:t>
+      </w:r>
+      <w:r>
+        <w:rPr>
+          <w:b/>
+          <w:bCs/>
+        </w:rPr>
+        <w:t xml:space="preserve">Android</w:t>
+      </w:r>
+      <w:r>
+        <w:t xml:space="preserve"> </w:t>
+      </w:r>
+      <w:r>
+        <w:t xml:space="preserve">apps for 2 years.</w:t>
       </w:r>
     </w:p>
     <w:p>
@@ -781,17 +823,49 @@
         </w:numPr>
       </w:pPr>
       <w:r>
-        <w:t xml:space="preserve">Developed and maintained native Android applications for 2 years; started in QA (3 years) with security, performance and usability testing.</w:t>
+        <w:t xml:space="preserve">Started in QA (3 years) with security, performance and usability testing.</w:t>
       </w:r>
     </w:p>
     <w:bookmarkEnd w:id="17"/>
     <w:bookmarkEnd w:id="18"/>
-    <w:bookmarkStart w:id="19" w:name="education"/>
+    <w:bookmarkStart w:id="20" w:name="projects"/>
     <w:p>
       <w:pPr>
         <w:pStyle w:val="Heading2"/>
       </w:pPr>
       <w:r>
+        <w:t xml:space="preserve">Projects</w:t>
+      </w:r>
+    </w:p>
+    <w:bookmarkStart w:id="19" w:name="Xe6495d5b75b64caa6cacf726513439e36f60fce"/>
+    <w:p>
+      <w:pPr>
+        <w:pStyle w:val="Heading3"/>
+      </w:pPr>
+      <w:r>
+        <w:t xml:space="preserve">Darkrunner — automated video pipeline (TypeScript/Node.js, private)</w:t>
+      </w:r>
+    </w:p>
+    <w:p>
+      <w:pPr>
+        <w:pStyle w:val="Compact"/>
+        <w:numPr>
+          <w:ilvl w:val="0"/>
+          <w:numId w:val="1007"/>
+        </w:numPr>
+      </w:pPr>
+      <w:r>
+        <w:t xml:space="preserve">TypeScript monorepo where LLM agents handle scripting, planning and QA: given only a channel name, it produced a full video (script, voice-over, images, effects, subtitles) and uploaded it to YouTube, up to 15 videos a day across 5 channels. Built with Remotion, Playwright, Ollama and ComfyUI.</w:t>
+      </w:r>
+    </w:p>
+    <w:bookmarkEnd w:id="19"/>
+    <w:bookmarkEnd w:id="20"/>
+    <w:bookmarkStart w:id="21" w:name="education"/>
+    <w:p>
+      <w:pPr>
+        <w:pStyle w:val="Heading2"/>
+      </w:pPr>
+      <w:r>
         <w:t xml:space="preserve">Education</w:t>
       </w:r>
     </w:p>
@@ -813,13 +887,41 @@
         <w:t xml:space="preserve">— Inatel (National Institute of Telecommunications) | 2014 – 2018</w:t>
       </w:r>
     </w:p>
-    <w:bookmarkEnd w:id="19"/>
-    <w:bookmarkStart w:id="20" w:name="languages"/>
+    <w:bookmarkEnd w:id="21"/>
+    <w:bookmarkStart w:id="22" w:name="certifications"/>
     <w:p>
       <w:pPr>
         <w:pStyle w:val="Heading2"/>
       </w:pPr>
       <w:r>
+        <w:t xml:space="preserve">Certifications</w:t>
+      </w:r>
+    </w:p>
+    <w:p>
+      <w:pPr>
+        <w:pStyle w:val="FirstParagraph"/>
+      </w:pPr>
+      <w:r>
+        <w:rPr>
+          <w:b/>
+          <w:bCs/>
+        </w:rPr>
+        <w:t xml:space="preserve">Architecting with Google Compute Engine</w:t>
+      </w:r>
+      <w:r>
+        <w:t xml:space="preserve"> </w:t>
+      </w:r>
+      <w:r>
+        <w:t xml:space="preserve">— Google Cloud | Mar 2022</w:t>
+      </w:r>
+    </w:p>
+    <w:bookmarkEnd w:id="22"/>
+    <w:bookmarkStart w:id="23" w:name="languages"/>
+    <w:p>
+      <w:pPr>
+        <w:pStyle w:val="Heading2"/>
+      </w:pPr>
+      <w:r>
         <w:t xml:space="preserve">Languages</w:t>
       </w:r>
     </w:p>
@@ -828,11 +930,11 @@
         <w:pStyle w:val="FirstParagraph"/>
       </w:pPr>
       <w:r>
-        <w:t xml:space="preserve">Portuguese (Native) · English (Full professional, C1)</w:t>
-      </w:r>
-    </w:p>
-    <w:bookmarkEnd w:id="20"/>
-    <w:bookmarkEnd w:id="21"/>
+        <w:t xml:space="preserve">Portuguese (Native) · English (Full professional; EF SET 71/100, C2)</w:t>
+      </w:r>
+    </w:p>
+    <w:bookmarkEnd w:id="23"/>
+    <w:bookmarkEnd w:id="24"/>
     <w:sectPr>
       <w:footnotePr>
         <w:numRestart w:val="eachSect"/>
@@ -1065,6 +1167,9 @@
     <w:abstractNumId w:val="991"/>
   </w:num>
   <w:num w:numId="1006">
+    <w:abstractNumId w:val="991"/>
+  </w:num>
+  <w:num w:numId="1007">
     <w:abstractNumId w:val="991"/>
   </w:num>
 </w:numbering>

</xml_diff>

<commit_message>
Date Unico promotion to Aug 2022 and add GCP to Unico stack
Co-Authored-By: Claude Opus 5.5 <noreply@anthropic.com>
Claude-Session: https://claude.ai/code/session_014tF2mZxbJZvQiCs7QA6cz7
</commit_message>
<xml_diff>
--- a/dist/Lucas-Selani-CV-Fullstack-EN.docx
+++ b/dist/Lucas-Selani-CV-Fullstack-EN.docx
@@ -528,7 +528,7 @@
           <w:i/>
           <w:iCs/>
         </w:rPr>
-        <w:t xml:space="preserve">Brazil’s leader in digital identity · Remote · Joined as Software Developer, promoted to Senior (IC5) in Jan 2023.</w:t>
+        <w:t xml:space="preserve">Brazil’s leader in digital identity · Remote · Joined as Software Developer, promoted to Senior (IC5) in Aug 2022.</w:t>
       </w:r>
     </w:p>
     <w:p>
@@ -825,7 +825,7 @@
         </w:numPr>
       </w:pPr>
       <w:r>
-        <w:t xml:space="preserve">Stack: Go, React, Flutter, Dart, Firebase, LaunchDarkly, Mixpanel, New Relic, incident.io.</w:t>
+        <w:t xml:space="preserve">Stack: Go, React, GCP, Flutter, Dart, Firebase, LaunchDarkly, Mixpanel, New Relic, incident.io.</w:t>
       </w:r>
     </w:p>
     <w:bookmarkEnd w:id="15"/>

</xml_diff>